<commit_message>
##Finalização de vendas e pagamentos – implementação completa
</commit_message>
<xml_diff>
--- a/Minhas anotacoes pessoais do projeto/AUXILIAR PARA TROCA DE MSGS COM O COPILOTE, SOBRE REGRAS DO SISTEMA E NEGOCIO.docx
+++ b/Minhas anotacoes pessoais do projeto/AUXILIAR PARA TROCA DE MSGS COM O COPILOTE, SOBRE REGRAS DO SISTEMA E NEGOCIO.docx
@@ -8,10 +8,175 @@
           <w:lang w:val="pt-BR"/>
         </w:rPr>
       </w:pPr>
-      <w:r>
-        <w:rPr>
-          <w:lang w:val="pt-BR"/>
-        </w:rPr>
+    </w:p>
+    <w:p>
+      <w:pPr>
+        <w:rPr>
+          <w:lang w:val="pt-BR"/>
+        </w:rPr>
+      </w:pPr>
+      <w:r>
+        <w:rPr>
+          <w:lang w:val="pt-BR"/>
+        </w:rPr>
+        <w:t xml:space="preserve">Temos um modelo que precisa ser integrado, ou seja, todas as transações financeiras devem ser consolidadas nos Centros Financeiros para fins de controle.  </w:t>
+      </w:r>
+    </w:p>
+    <w:p>
+      <w:pPr>
+        <w:rPr>
+          <w:lang w:val="pt-BR"/>
+        </w:rPr>
+      </w:pPr>
+      <w:r>
+        <w:rPr>
+          <w:lang w:val="pt-BR"/>
+        </w:rPr>
+        <w:t>Seja atraves do módulo de Vendas que gera entrada de dinheiro nos Centros Financeiros seja atraves do Financeiro que gera entraas e saidas no mesmos.</w:t>
+      </w:r>
+    </w:p>
+    <w:p>
+      <w:pPr>
+        <w:rPr>
+          <w:lang w:val="pt-BR"/>
+        </w:rPr>
+      </w:pPr>
+      <w:r>
+        <w:rPr>
+          <w:lang w:val="pt-BR"/>
+        </w:rPr>
+        <w:t>Inicialmente, temos alguns Centros Financeiros definidos no DatabaseInitializer.</w:t>
+      </w:r>
+    </w:p>
+    <w:p>
+      <w:pPr>
+        <w:rPr>
+          <w:lang w:val="pt-BR"/>
+        </w:rPr>
+      </w:pPr>
+      <w:r>
+        <w:rPr>
+          <w:lang w:val="pt-BR"/>
+        </w:rPr>
+        <w:t>De fato, ao meu ver, precisamos ter uma tabela com alguns Centros Financeiros predefinidos, assim como também uma associação em que algumas Formas de Pagamento sejam associados a certos Centros Financeiros.  Por exemplo: um cliente pode fazer um depósito na conta corrente do Brecho, do Socio1 ou do Socio2.  Eventualmente podemos criar um sócio3.  Podemos associar pagamentos em Cartao de Credito a um ou dois Centros Financeiros dependendo do cartao.</w:t>
+      </w:r>
+    </w:p>
+    <w:p>
+      <w:pPr>
+        <w:rPr>
+          <w:lang w:val="pt-BR"/>
+        </w:rPr>
+      </w:pPr>
+    </w:p>
+    <w:p>
+      <w:pPr>
+        <w:rPr>
+          <w:lang w:val="pt-BR"/>
+        </w:rPr>
+      </w:pPr>
+    </w:p>
+    <w:p>
+      <w:pPr>
+        <w:rPr>
+          <w:lang w:val="pt-BR"/>
+        </w:rPr>
+      </w:pPr>
+    </w:p>
+    <w:p>
+      <w:pPr>
+        <w:rPr>
+          <w:lang w:val="pt-BR"/>
+        </w:rPr>
+      </w:pPr>
+    </w:p>
+    <w:p>
+      <w:pPr>
+        <w:rPr>
+          <w:lang w:val="pt-BR"/>
+        </w:rPr>
+      </w:pPr>
+    </w:p>
+    <w:p>
+      <w:pPr>
+        <w:rPr>
+          <w:lang w:val="pt-BR"/>
+        </w:rPr>
+      </w:pPr>
+    </w:p>
+    <w:p>
+      <w:pPr>
+        <w:rPr>
+          <w:lang w:val="pt-BR"/>
+        </w:rPr>
+      </w:pPr>
+    </w:p>
+    <w:p>
+      <w:pPr>
+        <w:rPr>
+          <w:lang w:val="pt-BR"/>
+        </w:rPr>
+      </w:pPr>
+    </w:p>
+    <w:p>
+      <w:pPr>
+        <w:rPr>
+          <w:lang w:val="pt-BR"/>
+        </w:rPr>
+      </w:pPr>
+    </w:p>
+    <w:p>
+      <w:pPr>
+        <w:rPr>
+          <w:lang w:val="pt-BR"/>
+        </w:rPr>
+      </w:pPr>
+    </w:p>
+    <w:p>
+      <w:pPr>
+        <w:rPr>
+          <w:lang w:val="pt-BR"/>
+        </w:rPr>
+      </w:pPr>
+    </w:p>
+    <w:p>
+      <w:pPr>
+        <w:rPr>
+          <w:lang w:val="pt-BR"/>
+        </w:rPr>
+      </w:pPr>
+    </w:p>
+    <w:p>
+      <w:pPr>
+        <w:rPr>
+          <w:lang w:val="pt-BR"/>
+        </w:rPr>
+      </w:pPr>
+    </w:p>
+    <w:p>
+      <w:pPr>
+        <w:rPr>
+          <w:lang w:val="pt-BR"/>
+        </w:rPr>
+      </w:pPr>
+    </w:p>
+    <w:p>
+      <w:pPr>
+        <w:rPr>
+          <w:lang w:val="pt-BR"/>
+        </w:rPr>
+      </w:pPr>
+    </w:p>
+    <w:p>
+      <w:pPr>
+        <w:rPr>
+          <w:lang w:val="pt-BR"/>
+        </w:rPr>
+      </w:pPr>
+      <w:r>
+        <w:rPr>
+          <w:lang w:val="pt-BR"/>
+        </w:rPr>
+        <w:lastRenderedPageBreak/>
         <w:t xml:space="preserve">Para que o fluxo de entrada de material funcione </w:t>
       </w:r>
       <w:r>
@@ -1034,20 +1199,6 @@
         </w:rPr>
       </w:pPr>
     </w:p>
-    <w:p>
-      <w:pPr>
-        <w:rPr>
-          <w:lang w:val="pt-BR"/>
-        </w:rPr>
-      </w:pPr>
-    </w:p>
-    <w:p>
-      <w:pPr>
-        <w:rPr>
-          <w:lang w:val="pt-BR"/>
-        </w:rPr>
-      </w:pPr>
-    </w:p>
     <w:sectPr>
       <w:pgSz w:w="12240" w:h="15840"/>
       <w:pgMar w:top="1440" w:right="1440" w:bottom="1440" w:left="1440" w:header="708" w:footer="708" w:gutter="0"/>
@@ -1061,6 +1212,453 @@
 <file path=word/numbering.xml><?xml version="1.0" encoding="utf-8"?>
 <w:numbering xmlns:wpc="http://schemas.microsoft.com/office/word/2010/wordprocessingCanvas" xmlns:cx="http://schemas.microsoft.com/office/drawing/2014/chartex" xmlns:cx1="http://schemas.microsoft.com/office/drawing/2015/9/8/chartex" xmlns:cx2="http://schemas.microsoft.com/office/drawing/2015/10/21/chartex" xmlns:cx3="http://schemas.microsoft.com/office/drawing/2016/5/9/chartex" xmlns:cx4="http://schemas.microsoft.com/office/drawing/2016/5/10/chartex" xmlns:cx5="http://schemas.microsoft.com/office/drawing/2016/5/11/chartex" xmlns:cx6="http://schemas.microsoft.com/office/drawing/2016/5/12/chartex" xmlns:cx7="http://schemas.microsoft.com/office/drawing/2016/5/13/chartex" xmlns:cx8="http://schemas.microsoft.com/office/drawing/2016/5/14/chartex" xmlns:mc="http://schemas.openxmlformats.org/markup-compatibility/2006" xmlns:aink="http://schemas.microsoft.com/office/drawing/2016/ink" xmlns:am3d="http://schemas.microsoft.com/office/drawing/2017/model3d" xmlns:o="urn:schemas-microsoft-com:office:office" xmlns:oel="http://schemas.microsoft.com/office/2019/extlst" xmlns:r="http://schemas.openxmlformats.org/officeDocument/2006/relationships" xmlns:m="http://schemas.openxmlformats.org/officeDocument/2006/math" xmlns:v="urn:schemas-microsoft-com:vml" xmlns:wp14="http://schemas.microsoft.com/office/word/2010/wordprocessingDrawing" xmlns:wp="http://schemas.openxmlformats.org/drawingml/2006/wordprocessingDrawing" xmlns:w10="urn:schemas-microsoft-com:office:word" xmlns:w="http://schemas.openxmlformats.org/wordprocessingml/2006/main" xmlns:w14="http://schemas.microsoft.com/office/word/2010/wordml" xmlns:w15="http://schemas.microsoft.com/office/word/2012/wordml" xmlns:w16cex="http://schemas.microsoft.com/office/word/2018/wordml/cex" xmlns:w16cid="http://schemas.microsoft.com/office/word/2016/wordml/cid" xmlns:w16="http://schemas.microsoft.com/office/word/2018/wordml" xmlns:w16du="http://schemas.microsoft.com/office/word/2023/wordml/word16du" xmlns:w16sdtdh="http://schemas.microsoft.com/office/word/2020/wordml/sdtdatahash" xmlns:w16sdtfl="http://schemas.microsoft.com/office/word/2024/wordml/sdtformatlock" xmlns:w16se="http://schemas.microsoft.com/office/word/2015/wordml/symex" xmlns:wpg="http://schemas.microsoft.com/office/word/2010/wordprocessingGroup" xmlns:wpi="http://schemas.microsoft.com/office/word/2010/wordprocessingInk" xmlns:wne="http://schemas.microsoft.com/office/word/2006/wordml" xmlns:wps="http://schemas.microsoft.com/office/word/2010/wordprocessingShape" mc:Ignorable="w14 w15 w16se w16cid w16 w16cex w16sdtdh w16sdtfl w16du wp14">
   <w:abstractNum w:abstractNumId="0" w15:restartNumberingAfterBreak="0">
+    <w:nsid w:val="0741067B"/>
+    <w:multiLevelType w:val="multilevel"/>
+    <w:tmpl w:val="7A208990"/>
+    <w:lvl w:ilvl="0">
+      <w:start w:val="1"/>
+      <w:numFmt w:val="bullet"/>
+      <w:lvlText w:val=""/>
+      <w:lvlJc w:val="left"/>
+      <w:pPr>
+        <w:tabs>
+          <w:tab w:val="num" w:pos="720"/>
+        </w:tabs>
+        <w:ind w:left="720" w:hanging="360"/>
+      </w:pPr>
+      <w:rPr>
+        <w:rFonts w:ascii="Symbol" w:hAnsi="Symbol" w:hint="default"/>
+        <w:sz w:val="20"/>
+      </w:rPr>
+    </w:lvl>
+    <w:lvl w:ilvl="1" w:tentative="1">
+      <w:start w:val="1"/>
+      <w:numFmt w:val="bullet"/>
+      <w:lvlText w:val="o"/>
+      <w:lvlJc w:val="left"/>
+      <w:pPr>
+        <w:tabs>
+          <w:tab w:val="num" w:pos="1440"/>
+        </w:tabs>
+        <w:ind w:left="1440" w:hanging="360"/>
+      </w:pPr>
+      <w:rPr>
+        <w:rFonts w:ascii="Courier New" w:hAnsi="Courier New" w:hint="default"/>
+        <w:sz w:val="20"/>
+      </w:rPr>
+    </w:lvl>
+    <w:lvl w:ilvl="2" w:tentative="1">
+      <w:start w:val="1"/>
+      <w:numFmt w:val="bullet"/>
+      <w:lvlText w:val=""/>
+      <w:lvlJc w:val="left"/>
+      <w:pPr>
+        <w:tabs>
+          <w:tab w:val="num" w:pos="2160"/>
+        </w:tabs>
+        <w:ind w:left="2160" w:hanging="360"/>
+      </w:pPr>
+      <w:rPr>
+        <w:rFonts w:ascii="Wingdings" w:hAnsi="Wingdings" w:hint="default"/>
+        <w:sz w:val="20"/>
+      </w:rPr>
+    </w:lvl>
+    <w:lvl w:ilvl="3" w:tentative="1">
+      <w:start w:val="1"/>
+      <w:numFmt w:val="bullet"/>
+      <w:lvlText w:val=""/>
+      <w:lvlJc w:val="left"/>
+      <w:pPr>
+        <w:tabs>
+          <w:tab w:val="num" w:pos="2880"/>
+        </w:tabs>
+        <w:ind w:left="2880" w:hanging="360"/>
+      </w:pPr>
+      <w:rPr>
+        <w:rFonts w:ascii="Wingdings" w:hAnsi="Wingdings" w:hint="default"/>
+        <w:sz w:val="20"/>
+      </w:rPr>
+    </w:lvl>
+    <w:lvl w:ilvl="4" w:tentative="1">
+      <w:start w:val="1"/>
+      <w:numFmt w:val="bullet"/>
+      <w:lvlText w:val=""/>
+      <w:lvlJc w:val="left"/>
+      <w:pPr>
+        <w:tabs>
+          <w:tab w:val="num" w:pos="3600"/>
+        </w:tabs>
+        <w:ind w:left="3600" w:hanging="360"/>
+      </w:pPr>
+      <w:rPr>
+        <w:rFonts w:ascii="Wingdings" w:hAnsi="Wingdings" w:hint="default"/>
+        <w:sz w:val="20"/>
+      </w:rPr>
+    </w:lvl>
+    <w:lvl w:ilvl="5" w:tentative="1">
+      <w:start w:val="1"/>
+      <w:numFmt w:val="bullet"/>
+      <w:lvlText w:val=""/>
+      <w:lvlJc w:val="left"/>
+      <w:pPr>
+        <w:tabs>
+          <w:tab w:val="num" w:pos="4320"/>
+        </w:tabs>
+        <w:ind w:left="4320" w:hanging="360"/>
+      </w:pPr>
+      <w:rPr>
+        <w:rFonts w:ascii="Wingdings" w:hAnsi="Wingdings" w:hint="default"/>
+        <w:sz w:val="20"/>
+      </w:rPr>
+    </w:lvl>
+    <w:lvl w:ilvl="6" w:tentative="1">
+      <w:start w:val="1"/>
+      <w:numFmt w:val="bullet"/>
+      <w:lvlText w:val=""/>
+      <w:lvlJc w:val="left"/>
+      <w:pPr>
+        <w:tabs>
+          <w:tab w:val="num" w:pos="5040"/>
+        </w:tabs>
+        <w:ind w:left="5040" w:hanging="360"/>
+      </w:pPr>
+      <w:rPr>
+        <w:rFonts w:ascii="Wingdings" w:hAnsi="Wingdings" w:hint="default"/>
+        <w:sz w:val="20"/>
+      </w:rPr>
+    </w:lvl>
+    <w:lvl w:ilvl="7" w:tentative="1">
+      <w:start w:val="1"/>
+      <w:numFmt w:val="bullet"/>
+      <w:lvlText w:val=""/>
+      <w:lvlJc w:val="left"/>
+      <w:pPr>
+        <w:tabs>
+          <w:tab w:val="num" w:pos="5760"/>
+        </w:tabs>
+        <w:ind w:left="5760" w:hanging="360"/>
+      </w:pPr>
+      <w:rPr>
+        <w:rFonts w:ascii="Wingdings" w:hAnsi="Wingdings" w:hint="default"/>
+        <w:sz w:val="20"/>
+      </w:rPr>
+    </w:lvl>
+    <w:lvl w:ilvl="8" w:tentative="1">
+      <w:start w:val="1"/>
+      <w:numFmt w:val="bullet"/>
+      <w:lvlText w:val=""/>
+      <w:lvlJc w:val="left"/>
+      <w:pPr>
+        <w:tabs>
+          <w:tab w:val="num" w:pos="6480"/>
+        </w:tabs>
+        <w:ind w:left="6480" w:hanging="360"/>
+      </w:pPr>
+      <w:rPr>
+        <w:rFonts w:ascii="Wingdings" w:hAnsi="Wingdings" w:hint="default"/>
+        <w:sz w:val="20"/>
+      </w:rPr>
+    </w:lvl>
+  </w:abstractNum>
+  <w:abstractNum w:abstractNumId="1" w15:restartNumberingAfterBreak="0">
+    <w:nsid w:val="1EDB5D02"/>
+    <w:multiLevelType w:val="multilevel"/>
+    <w:tmpl w:val="AEBE3D7E"/>
+    <w:lvl w:ilvl="0">
+      <w:start w:val="1"/>
+      <w:numFmt w:val="bullet"/>
+      <w:lvlText w:val=""/>
+      <w:lvlJc w:val="left"/>
+      <w:pPr>
+        <w:tabs>
+          <w:tab w:val="num" w:pos="720"/>
+        </w:tabs>
+        <w:ind w:left="720" w:hanging="360"/>
+      </w:pPr>
+      <w:rPr>
+        <w:rFonts w:ascii="Symbol" w:hAnsi="Symbol" w:hint="default"/>
+        <w:sz w:val="20"/>
+      </w:rPr>
+    </w:lvl>
+    <w:lvl w:ilvl="1" w:tentative="1">
+      <w:start w:val="1"/>
+      <w:numFmt w:val="bullet"/>
+      <w:lvlText w:val="o"/>
+      <w:lvlJc w:val="left"/>
+      <w:pPr>
+        <w:tabs>
+          <w:tab w:val="num" w:pos="1440"/>
+        </w:tabs>
+        <w:ind w:left="1440" w:hanging="360"/>
+      </w:pPr>
+      <w:rPr>
+        <w:rFonts w:ascii="Courier New" w:hAnsi="Courier New" w:hint="default"/>
+        <w:sz w:val="20"/>
+      </w:rPr>
+    </w:lvl>
+    <w:lvl w:ilvl="2" w:tentative="1">
+      <w:start w:val="1"/>
+      <w:numFmt w:val="bullet"/>
+      <w:lvlText w:val=""/>
+      <w:lvlJc w:val="left"/>
+      <w:pPr>
+        <w:tabs>
+          <w:tab w:val="num" w:pos="2160"/>
+        </w:tabs>
+        <w:ind w:left="2160" w:hanging="360"/>
+      </w:pPr>
+      <w:rPr>
+        <w:rFonts w:ascii="Wingdings" w:hAnsi="Wingdings" w:hint="default"/>
+        <w:sz w:val="20"/>
+      </w:rPr>
+    </w:lvl>
+    <w:lvl w:ilvl="3" w:tentative="1">
+      <w:start w:val="1"/>
+      <w:numFmt w:val="bullet"/>
+      <w:lvlText w:val=""/>
+      <w:lvlJc w:val="left"/>
+      <w:pPr>
+        <w:tabs>
+          <w:tab w:val="num" w:pos="2880"/>
+        </w:tabs>
+        <w:ind w:left="2880" w:hanging="360"/>
+      </w:pPr>
+      <w:rPr>
+        <w:rFonts w:ascii="Wingdings" w:hAnsi="Wingdings" w:hint="default"/>
+        <w:sz w:val="20"/>
+      </w:rPr>
+    </w:lvl>
+    <w:lvl w:ilvl="4" w:tentative="1">
+      <w:start w:val="1"/>
+      <w:numFmt w:val="bullet"/>
+      <w:lvlText w:val=""/>
+      <w:lvlJc w:val="left"/>
+      <w:pPr>
+        <w:tabs>
+          <w:tab w:val="num" w:pos="3600"/>
+        </w:tabs>
+        <w:ind w:left="3600" w:hanging="360"/>
+      </w:pPr>
+      <w:rPr>
+        <w:rFonts w:ascii="Wingdings" w:hAnsi="Wingdings" w:hint="default"/>
+        <w:sz w:val="20"/>
+      </w:rPr>
+    </w:lvl>
+    <w:lvl w:ilvl="5" w:tentative="1">
+      <w:start w:val="1"/>
+      <w:numFmt w:val="bullet"/>
+      <w:lvlText w:val=""/>
+      <w:lvlJc w:val="left"/>
+      <w:pPr>
+        <w:tabs>
+          <w:tab w:val="num" w:pos="4320"/>
+        </w:tabs>
+        <w:ind w:left="4320" w:hanging="360"/>
+      </w:pPr>
+      <w:rPr>
+        <w:rFonts w:ascii="Wingdings" w:hAnsi="Wingdings" w:hint="default"/>
+        <w:sz w:val="20"/>
+      </w:rPr>
+    </w:lvl>
+    <w:lvl w:ilvl="6" w:tentative="1">
+      <w:start w:val="1"/>
+      <w:numFmt w:val="bullet"/>
+      <w:lvlText w:val=""/>
+      <w:lvlJc w:val="left"/>
+      <w:pPr>
+        <w:tabs>
+          <w:tab w:val="num" w:pos="5040"/>
+        </w:tabs>
+        <w:ind w:left="5040" w:hanging="360"/>
+      </w:pPr>
+      <w:rPr>
+        <w:rFonts w:ascii="Wingdings" w:hAnsi="Wingdings" w:hint="default"/>
+        <w:sz w:val="20"/>
+      </w:rPr>
+    </w:lvl>
+    <w:lvl w:ilvl="7" w:tentative="1">
+      <w:start w:val="1"/>
+      <w:numFmt w:val="bullet"/>
+      <w:lvlText w:val=""/>
+      <w:lvlJc w:val="left"/>
+      <w:pPr>
+        <w:tabs>
+          <w:tab w:val="num" w:pos="5760"/>
+        </w:tabs>
+        <w:ind w:left="5760" w:hanging="360"/>
+      </w:pPr>
+      <w:rPr>
+        <w:rFonts w:ascii="Wingdings" w:hAnsi="Wingdings" w:hint="default"/>
+        <w:sz w:val="20"/>
+      </w:rPr>
+    </w:lvl>
+    <w:lvl w:ilvl="8" w:tentative="1">
+      <w:start w:val="1"/>
+      <w:numFmt w:val="bullet"/>
+      <w:lvlText w:val=""/>
+      <w:lvlJc w:val="left"/>
+      <w:pPr>
+        <w:tabs>
+          <w:tab w:val="num" w:pos="6480"/>
+        </w:tabs>
+        <w:ind w:left="6480" w:hanging="360"/>
+      </w:pPr>
+      <w:rPr>
+        <w:rFonts w:ascii="Wingdings" w:hAnsi="Wingdings" w:hint="default"/>
+        <w:sz w:val="20"/>
+      </w:rPr>
+    </w:lvl>
+  </w:abstractNum>
+  <w:abstractNum w:abstractNumId="2" w15:restartNumberingAfterBreak="0">
+    <w:nsid w:val="29E86110"/>
+    <w:multiLevelType w:val="multilevel"/>
+    <w:tmpl w:val="EFF41A72"/>
+    <w:lvl w:ilvl="0">
+      <w:start w:val="1"/>
+      <w:numFmt w:val="bullet"/>
+      <w:lvlText w:val=""/>
+      <w:lvlJc w:val="left"/>
+      <w:pPr>
+        <w:tabs>
+          <w:tab w:val="num" w:pos="720"/>
+        </w:tabs>
+        <w:ind w:left="720" w:hanging="360"/>
+      </w:pPr>
+      <w:rPr>
+        <w:rFonts w:ascii="Symbol" w:hAnsi="Symbol" w:hint="default"/>
+        <w:sz w:val="20"/>
+      </w:rPr>
+    </w:lvl>
+    <w:lvl w:ilvl="1" w:tentative="1">
+      <w:start w:val="1"/>
+      <w:numFmt w:val="bullet"/>
+      <w:lvlText w:val="o"/>
+      <w:lvlJc w:val="left"/>
+      <w:pPr>
+        <w:tabs>
+          <w:tab w:val="num" w:pos="1440"/>
+        </w:tabs>
+        <w:ind w:left="1440" w:hanging="360"/>
+      </w:pPr>
+      <w:rPr>
+        <w:rFonts w:ascii="Courier New" w:hAnsi="Courier New" w:hint="default"/>
+        <w:sz w:val="20"/>
+      </w:rPr>
+    </w:lvl>
+    <w:lvl w:ilvl="2" w:tentative="1">
+      <w:start w:val="1"/>
+      <w:numFmt w:val="bullet"/>
+      <w:lvlText w:val=""/>
+      <w:lvlJc w:val="left"/>
+      <w:pPr>
+        <w:tabs>
+          <w:tab w:val="num" w:pos="2160"/>
+        </w:tabs>
+        <w:ind w:left="2160" w:hanging="360"/>
+      </w:pPr>
+      <w:rPr>
+        <w:rFonts w:ascii="Wingdings" w:hAnsi="Wingdings" w:hint="default"/>
+        <w:sz w:val="20"/>
+      </w:rPr>
+    </w:lvl>
+    <w:lvl w:ilvl="3" w:tentative="1">
+      <w:start w:val="1"/>
+      <w:numFmt w:val="bullet"/>
+      <w:lvlText w:val=""/>
+      <w:lvlJc w:val="left"/>
+      <w:pPr>
+        <w:tabs>
+          <w:tab w:val="num" w:pos="2880"/>
+        </w:tabs>
+        <w:ind w:left="2880" w:hanging="360"/>
+      </w:pPr>
+      <w:rPr>
+        <w:rFonts w:ascii="Wingdings" w:hAnsi="Wingdings" w:hint="default"/>
+        <w:sz w:val="20"/>
+      </w:rPr>
+    </w:lvl>
+    <w:lvl w:ilvl="4" w:tentative="1">
+      <w:start w:val="1"/>
+      <w:numFmt w:val="bullet"/>
+      <w:lvlText w:val=""/>
+      <w:lvlJc w:val="left"/>
+      <w:pPr>
+        <w:tabs>
+          <w:tab w:val="num" w:pos="3600"/>
+        </w:tabs>
+        <w:ind w:left="3600" w:hanging="360"/>
+      </w:pPr>
+      <w:rPr>
+        <w:rFonts w:ascii="Wingdings" w:hAnsi="Wingdings" w:hint="default"/>
+        <w:sz w:val="20"/>
+      </w:rPr>
+    </w:lvl>
+    <w:lvl w:ilvl="5" w:tentative="1">
+      <w:start w:val="1"/>
+      <w:numFmt w:val="bullet"/>
+      <w:lvlText w:val=""/>
+      <w:lvlJc w:val="left"/>
+      <w:pPr>
+        <w:tabs>
+          <w:tab w:val="num" w:pos="4320"/>
+        </w:tabs>
+        <w:ind w:left="4320" w:hanging="360"/>
+      </w:pPr>
+      <w:rPr>
+        <w:rFonts w:ascii="Wingdings" w:hAnsi="Wingdings" w:hint="default"/>
+        <w:sz w:val="20"/>
+      </w:rPr>
+    </w:lvl>
+    <w:lvl w:ilvl="6" w:tentative="1">
+      <w:start w:val="1"/>
+      <w:numFmt w:val="bullet"/>
+      <w:lvlText w:val=""/>
+      <w:lvlJc w:val="left"/>
+      <w:pPr>
+        <w:tabs>
+          <w:tab w:val="num" w:pos="5040"/>
+        </w:tabs>
+        <w:ind w:left="5040" w:hanging="360"/>
+      </w:pPr>
+      <w:rPr>
+        <w:rFonts w:ascii="Wingdings" w:hAnsi="Wingdings" w:hint="default"/>
+        <w:sz w:val="20"/>
+      </w:rPr>
+    </w:lvl>
+    <w:lvl w:ilvl="7" w:tentative="1">
+      <w:start w:val="1"/>
+      <w:numFmt w:val="bullet"/>
+      <w:lvlText w:val=""/>
+      <w:lvlJc w:val="left"/>
+      <w:pPr>
+        <w:tabs>
+          <w:tab w:val="num" w:pos="5760"/>
+        </w:tabs>
+        <w:ind w:left="5760" w:hanging="360"/>
+      </w:pPr>
+      <w:rPr>
+        <w:rFonts w:ascii="Wingdings" w:hAnsi="Wingdings" w:hint="default"/>
+        <w:sz w:val="20"/>
+      </w:rPr>
+    </w:lvl>
+    <w:lvl w:ilvl="8" w:tentative="1">
+      <w:start w:val="1"/>
+      <w:numFmt w:val="bullet"/>
+      <w:lvlText w:val=""/>
+      <w:lvlJc w:val="left"/>
+      <w:pPr>
+        <w:tabs>
+          <w:tab w:val="num" w:pos="6480"/>
+        </w:tabs>
+        <w:ind w:left="6480" w:hanging="360"/>
+      </w:pPr>
+      <w:rPr>
+        <w:rFonts w:ascii="Wingdings" w:hAnsi="Wingdings" w:hint="default"/>
+        <w:sz w:val="20"/>
+      </w:rPr>
+    </w:lvl>
+  </w:abstractNum>
+  <w:abstractNum w:abstractNumId="3" w15:restartNumberingAfterBreak="0">
     <w:nsid w:val="588B06AA"/>
     <w:multiLevelType w:val="hybridMultilevel"/>
     <w:tmpl w:val="3CC0ED36"/>
@@ -1149,7 +1747,168 @@
       </w:pPr>
     </w:lvl>
   </w:abstractNum>
+  <w:abstractNum w:abstractNumId="4" w15:restartNumberingAfterBreak="0">
+    <w:nsid w:val="6F130B31"/>
+    <w:multiLevelType w:val="multilevel"/>
+    <w:tmpl w:val="19263FE8"/>
+    <w:lvl w:ilvl="0">
+      <w:start w:val="1"/>
+      <w:numFmt w:val="bullet"/>
+      <w:lvlText w:val=""/>
+      <w:lvlJc w:val="left"/>
+      <w:pPr>
+        <w:tabs>
+          <w:tab w:val="num" w:pos="720"/>
+        </w:tabs>
+        <w:ind w:left="720" w:hanging="360"/>
+      </w:pPr>
+      <w:rPr>
+        <w:rFonts w:ascii="Symbol" w:hAnsi="Symbol" w:hint="default"/>
+        <w:sz w:val="20"/>
+      </w:rPr>
+    </w:lvl>
+    <w:lvl w:ilvl="1" w:tentative="1">
+      <w:start w:val="1"/>
+      <w:numFmt w:val="bullet"/>
+      <w:lvlText w:val="o"/>
+      <w:lvlJc w:val="left"/>
+      <w:pPr>
+        <w:tabs>
+          <w:tab w:val="num" w:pos="1440"/>
+        </w:tabs>
+        <w:ind w:left="1440" w:hanging="360"/>
+      </w:pPr>
+      <w:rPr>
+        <w:rFonts w:ascii="Courier New" w:hAnsi="Courier New" w:hint="default"/>
+        <w:sz w:val="20"/>
+      </w:rPr>
+    </w:lvl>
+    <w:lvl w:ilvl="2" w:tentative="1">
+      <w:start w:val="1"/>
+      <w:numFmt w:val="bullet"/>
+      <w:lvlText w:val=""/>
+      <w:lvlJc w:val="left"/>
+      <w:pPr>
+        <w:tabs>
+          <w:tab w:val="num" w:pos="2160"/>
+        </w:tabs>
+        <w:ind w:left="2160" w:hanging="360"/>
+      </w:pPr>
+      <w:rPr>
+        <w:rFonts w:ascii="Wingdings" w:hAnsi="Wingdings" w:hint="default"/>
+        <w:sz w:val="20"/>
+      </w:rPr>
+    </w:lvl>
+    <w:lvl w:ilvl="3" w:tentative="1">
+      <w:start w:val="1"/>
+      <w:numFmt w:val="bullet"/>
+      <w:lvlText w:val=""/>
+      <w:lvlJc w:val="left"/>
+      <w:pPr>
+        <w:tabs>
+          <w:tab w:val="num" w:pos="2880"/>
+        </w:tabs>
+        <w:ind w:left="2880" w:hanging="360"/>
+      </w:pPr>
+      <w:rPr>
+        <w:rFonts w:ascii="Wingdings" w:hAnsi="Wingdings" w:hint="default"/>
+        <w:sz w:val="20"/>
+      </w:rPr>
+    </w:lvl>
+    <w:lvl w:ilvl="4" w:tentative="1">
+      <w:start w:val="1"/>
+      <w:numFmt w:val="bullet"/>
+      <w:lvlText w:val=""/>
+      <w:lvlJc w:val="left"/>
+      <w:pPr>
+        <w:tabs>
+          <w:tab w:val="num" w:pos="3600"/>
+        </w:tabs>
+        <w:ind w:left="3600" w:hanging="360"/>
+      </w:pPr>
+      <w:rPr>
+        <w:rFonts w:ascii="Wingdings" w:hAnsi="Wingdings" w:hint="default"/>
+        <w:sz w:val="20"/>
+      </w:rPr>
+    </w:lvl>
+    <w:lvl w:ilvl="5" w:tentative="1">
+      <w:start w:val="1"/>
+      <w:numFmt w:val="bullet"/>
+      <w:lvlText w:val=""/>
+      <w:lvlJc w:val="left"/>
+      <w:pPr>
+        <w:tabs>
+          <w:tab w:val="num" w:pos="4320"/>
+        </w:tabs>
+        <w:ind w:left="4320" w:hanging="360"/>
+      </w:pPr>
+      <w:rPr>
+        <w:rFonts w:ascii="Wingdings" w:hAnsi="Wingdings" w:hint="default"/>
+        <w:sz w:val="20"/>
+      </w:rPr>
+    </w:lvl>
+    <w:lvl w:ilvl="6" w:tentative="1">
+      <w:start w:val="1"/>
+      <w:numFmt w:val="bullet"/>
+      <w:lvlText w:val=""/>
+      <w:lvlJc w:val="left"/>
+      <w:pPr>
+        <w:tabs>
+          <w:tab w:val="num" w:pos="5040"/>
+        </w:tabs>
+        <w:ind w:left="5040" w:hanging="360"/>
+      </w:pPr>
+      <w:rPr>
+        <w:rFonts w:ascii="Wingdings" w:hAnsi="Wingdings" w:hint="default"/>
+        <w:sz w:val="20"/>
+      </w:rPr>
+    </w:lvl>
+    <w:lvl w:ilvl="7" w:tentative="1">
+      <w:start w:val="1"/>
+      <w:numFmt w:val="bullet"/>
+      <w:lvlText w:val=""/>
+      <w:lvlJc w:val="left"/>
+      <w:pPr>
+        <w:tabs>
+          <w:tab w:val="num" w:pos="5760"/>
+        </w:tabs>
+        <w:ind w:left="5760" w:hanging="360"/>
+      </w:pPr>
+      <w:rPr>
+        <w:rFonts w:ascii="Wingdings" w:hAnsi="Wingdings" w:hint="default"/>
+        <w:sz w:val="20"/>
+      </w:rPr>
+    </w:lvl>
+    <w:lvl w:ilvl="8" w:tentative="1">
+      <w:start w:val="1"/>
+      <w:numFmt w:val="bullet"/>
+      <w:lvlText w:val=""/>
+      <w:lvlJc w:val="left"/>
+      <w:pPr>
+        <w:tabs>
+          <w:tab w:val="num" w:pos="6480"/>
+        </w:tabs>
+        <w:ind w:left="6480" w:hanging="360"/>
+      </w:pPr>
+      <w:rPr>
+        <w:rFonts w:ascii="Wingdings" w:hAnsi="Wingdings" w:hint="default"/>
+        <w:sz w:val="20"/>
+      </w:rPr>
+    </w:lvl>
+  </w:abstractNum>
   <w:num w:numId="1" w16cid:durableId="770930900">
+    <w:abstractNumId w:val="3"/>
+  </w:num>
+  <w:num w:numId="2" w16cid:durableId="1053387718">
+    <w:abstractNumId w:val="1"/>
+  </w:num>
+  <w:num w:numId="3" w16cid:durableId="77555516">
+    <w:abstractNumId w:val="4"/>
+  </w:num>
+  <w:num w:numId="4" w16cid:durableId="1966352242">
+    <w:abstractNumId w:val="2"/>
+  </w:num>
+  <w:num w:numId="5" w16cid:durableId="2100172965">
     <w:abstractNumId w:val="0"/>
   </w:num>
 </w:numbering>
@@ -1758,6 +2517,7 @@
   <w:style w:type="character" w:default="1" w:styleId="DefaultParagraphFont">
     <w:name w:val="Default Paragraph Font"/>
     <w:uiPriority w:val="1"/>
+    <w:semiHidden/>
     <w:unhideWhenUsed/>
   </w:style>
   <w:style w:type="table" w:default="1" w:styleId="TableNormal">

</xml_diff>

<commit_message>
Add CategoriasFinanceiras table, repository and admin form; integrate into finance flows; remove main menu shortcut
</commit_message>
<xml_diff>
--- a/Minhas anotacoes pessoais do projeto/AUXILIAR PARA TROCA DE MSGS COM O COPILOTE, SOBRE REGRAS DO SISTEMA E NEGOCIO.docx
+++ b/Minhas anotacoes pessoais do projeto/AUXILIAR PARA TROCA DE MSGS COM O COPILOTE, SOBRE REGRAS DO SISTEMA E NEGOCIO.docx
@@ -665,6 +665,9 @@
     </w:p>
     <w:p>
       <w:pPr>
+        <w:pBdr>
+          <w:bottom w:val="single" w:sz="6" w:space="1" w:color="auto"/>
+        </w:pBdr>
         <w:rPr>
           <w:lang w:val="pt-BR"/>
         </w:rPr>
@@ -682,114 +685,987 @@
           <w:lang w:val="pt-BR"/>
         </w:rPr>
       </w:pPr>
-    </w:p>
-    <w:p>
-      <w:pPr>
-        <w:rPr>
-          <w:lang w:val="pt-BR"/>
-        </w:rPr>
-      </w:pPr>
-    </w:p>
-    <w:p>
-      <w:pPr>
-        <w:rPr>
-          <w:lang w:val="pt-BR"/>
-        </w:rPr>
-      </w:pPr>
-    </w:p>
-    <w:p>
-      <w:pPr>
-        <w:rPr>
-          <w:lang w:val="pt-BR"/>
-        </w:rPr>
-      </w:pPr>
-    </w:p>
-    <w:p>
-      <w:pPr>
-        <w:rPr>
-          <w:lang w:val="pt-BR"/>
-        </w:rPr>
-      </w:pPr>
-    </w:p>
-    <w:p>
-      <w:pPr>
-        <w:rPr>
-          <w:lang w:val="pt-BR"/>
-        </w:rPr>
-      </w:pPr>
-    </w:p>
-    <w:p>
-      <w:pPr>
-        <w:rPr>
-          <w:lang w:val="pt-BR"/>
-        </w:rPr>
-      </w:pPr>
-    </w:p>
-    <w:p>
-      <w:pPr>
-        <w:rPr>
-          <w:lang w:val="pt-BR"/>
-        </w:rPr>
-      </w:pPr>
-    </w:p>
-    <w:p>
-      <w:pPr>
-        <w:rPr>
-          <w:lang w:val="pt-BR"/>
-        </w:rPr>
-      </w:pPr>
-    </w:p>
-    <w:p>
-      <w:pPr>
-        <w:rPr>
-          <w:lang w:val="pt-BR"/>
-        </w:rPr>
-      </w:pPr>
-    </w:p>
-    <w:p>
-      <w:pPr>
-        <w:rPr>
-          <w:lang w:val="pt-BR"/>
-        </w:rPr>
-      </w:pPr>
-      <w:r>
-        <w:rPr>
-          <w:lang w:val="pt-BR"/>
-        </w:rPr>
-        <w:t xml:space="preserve">Para que o fluxo de entrada de material funcione </w:t>
-      </w:r>
-      <w:r>
+      <w:r>
+        <w:rPr>
+          <w:lang w:val="pt-BR"/>
+        </w:rPr>
+        <w:t>Complementação</w:t>
+      </w:r>
+    </w:p>
+    <w:p>
+      <w:pPr>
+        <w:rPr>
+          <w:lang w:val="pt-BR"/>
+        </w:rPr>
+      </w:pPr>
+      <w:r>
+        <w:rPr>
+          <w:lang w:val="pt-BR"/>
+        </w:rPr>
+        <w:t>Complementando as instruções anteriores, preciso que você adicione ao módulo Financeiro uma estrutura de categorias de movimentação financeira.</w:t>
+      </w:r>
+    </w:p>
+    <w:p>
+      <w:pPr>
+        <w:rPr>
+          <w:lang w:val="pt-BR"/>
+        </w:rPr>
+      </w:pPr>
+    </w:p>
+    <w:p>
+      <w:pPr>
+        <w:rPr>
+          <w:lang w:val="pt-BR"/>
+        </w:rPr>
+      </w:pPr>
+      <w:r>
+        <w:rPr>
+          <w:lang w:val="pt-BR"/>
+        </w:rPr>
+        <w:t>Objetivo:</w:t>
+      </w:r>
+    </w:p>
+    <w:p>
+      <w:pPr>
+        <w:rPr>
+          <w:lang w:val="pt-BR"/>
+        </w:rPr>
+      </w:pPr>
+      <w:r>
+        <w:rPr>
+          <w:lang w:val="pt-BR"/>
+        </w:rPr>
+        <w:t>Criar uma tabela chamada CategoriasFinanceiras e utilizá-la para classificar todas as movimentações financeiras do sistema.</w:t>
+      </w:r>
+    </w:p>
+    <w:p>
+      <w:pPr>
+        <w:rPr>
+          <w:lang w:val="pt-BR"/>
+        </w:rPr>
+      </w:pPr>
+    </w:p>
+    <w:p>
+      <w:pPr>
+        <w:rPr>
+          <w:lang w:val="pt-BR"/>
+        </w:rPr>
+      </w:pPr>
+      <w:r>
+        <w:rPr>
+          <w:lang w:val="pt-BR"/>
+        </w:rPr>
+        <w:t>As categorias devem ser poucas, simples e suficientes para gerar um relatório financeiro mensal (DRE simplificado). Use exatamente estas categorias:</w:t>
+      </w:r>
+    </w:p>
+    <w:p>
+      <w:pPr>
+        <w:rPr>
+          <w:lang w:val="pt-BR"/>
+        </w:rPr>
+      </w:pPr>
+    </w:p>
+    <w:p>
+      <w:pPr>
+        <w:pStyle w:val="ListParagraph"/>
+        <w:numPr>
+          <w:ilvl w:val="0"/>
+          <w:numId w:val="7"/>
+        </w:numPr>
+        <w:rPr>
+          <w:lang w:val="pt-BR"/>
+        </w:rPr>
+      </w:pPr>
+      <w:r>
+        <w:rPr>
+          <w:lang w:val="pt-BR"/>
+        </w:rPr>
+        <w:t>RECEITAS</w:t>
+      </w:r>
+    </w:p>
+    <w:p>
+      <w:pPr>
+        <w:pStyle w:val="ListParagraph"/>
+        <w:numPr>
+          <w:ilvl w:val="1"/>
+          <w:numId w:val="7"/>
+        </w:numPr>
+        <w:rPr>
+          <w:lang w:val="pt-BR"/>
+        </w:rPr>
+      </w:pPr>
+      <w:r>
+        <w:rPr>
+          <w:lang w:val="pt-BR"/>
+        </w:rPr>
+        <w:t>Receita de Vendas</w:t>
+      </w:r>
+    </w:p>
+    <w:p>
+      <w:pPr>
+        <w:pStyle w:val="ListParagraph"/>
+        <w:numPr>
+          <w:ilvl w:val="1"/>
+          <w:numId w:val="7"/>
+        </w:numPr>
+        <w:rPr>
+          <w:lang w:val="pt-BR"/>
+        </w:rPr>
+      </w:pPr>
+      <w:r>
+        <w:rPr>
+          <w:lang w:val="pt-BR"/>
+        </w:rPr>
+        <w:t>Outras Receitas</w:t>
+      </w:r>
+      <w:r>
+        <w:rPr>
+          <w:lang w:val="pt-BR"/>
+        </w:rPr>
+        <w:t xml:space="preserve"> </w:t>
+      </w:r>
+    </w:p>
+    <w:p>
+      <w:pPr>
+        <w:rPr>
+          <w:lang w:val="pt-BR"/>
+        </w:rPr>
+      </w:pPr>
+    </w:p>
+    <w:p>
+      <w:pPr>
+        <w:pStyle w:val="ListParagraph"/>
+        <w:numPr>
+          <w:ilvl w:val="0"/>
+          <w:numId w:val="7"/>
+        </w:numPr>
+        <w:rPr>
+          <w:lang w:val="pt-BR"/>
+        </w:rPr>
+      </w:pPr>
+      <w:r>
+        <w:rPr>
+          <w:lang w:val="pt-BR"/>
+        </w:rPr>
+        <w:t>CUSTOS</w:t>
+      </w:r>
+    </w:p>
+    <w:p>
+      <w:pPr>
+        <w:pStyle w:val="ListParagraph"/>
+        <w:numPr>
+          <w:ilvl w:val="1"/>
+          <w:numId w:val="7"/>
+        </w:numPr>
+        <w:rPr>
+          <w:lang w:val="pt-BR"/>
+        </w:rPr>
+      </w:pPr>
+      <w:r>
+        <w:rPr>
+          <w:lang w:val="pt-BR"/>
+        </w:rPr>
+        <w:t>Compra de Mercadorias</w:t>
+      </w:r>
+    </w:p>
+    <w:p>
+      <w:pPr>
+        <w:pStyle w:val="ListParagraph"/>
+        <w:numPr>
+          <w:ilvl w:val="1"/>
+          <w:numId w:val="7"/>
+        </w:numPr>
+        <w:rPr>
+          <w:lang w:val="pt-BR"/>
+        </w:rPr>
+      </w:pPr>
+      <w:r>
+        <w:rPr>
+          <w:lang w:val="pt-BR"/>
+        </w:rPr>
+        <w:t>Repasse a Consignados / PN</w:t>
+      </w:r>
+    </w:p>
+    <w:p>
+      <w:pPr>
+        <w:pStyle w:val="ListParagraph"/>
+        <w:numPr>
+          <w:ilvl w:val="1"/>
+          <w:numId w:val="7"/>
+        </w:numPr>
+        <w:rPr>
+          <w:lang w:val="pt-BR"/>
+        </w:rPr>
+      </w:pPr>
+      <w:r>
+        <w:rPr>
+          <w:lang w:val="pt-BR"/>
+        </w:rPr>
+        <w:t>Outros Custos</w:t>
+      </w:r>
+    </w:p>
+    <w:p>
+      <w:pPr>
+        <w:rPr>
+          <w:lang w:val="pt-BR"/>
+        </w:rPr>
+      </w:pPr>
+    </w:p>
+    <w:p>
+      <w:pPr>
+        <w:pStyle w:val="ListParagraph"/>
+        <w:numPr>
+          <w:ilvl w:val="0"/>
+          <w:numId w:val="7"/>
+        </w:numPr>
+        <w:rPr>
+          <w:lang w:val="pt-BR"/>
+        </w:rPr>
+      </w:pPr>
+      <w:r>
+        <w:rPr>
+          <w:lang w:val="pt-BR"/>
+        </w:rPr>
+        <w:t>DESPESAS OPERACIONAIS</w:t>
+      </w:r>
+    </w:p>
+    <w:p>
+      <w:pPr>
+        <w:pStyle w:val="ListParagraph"/>
+        <w:numPr>
+          <w:ilvl w:val="1"/>
+          <w:numId w:val="7"/>
+        </w:numPr>
+        <w:rPr>
+          <w:lang w:val="pt-BR"/>
+        </w:rPr>
+      </w:pPr>
+      <w:r>
+        <w:rPr>
+          <w:lang w:val="pt-BR"/>
+        </w:rPr>
+        <w:t>Despesas Administrativas</w:t>
+      </w:r>
+    </w:p>
+    <w:p>
+      <w:pPr>
+        <w:pStyle w:val="ListParagraph"/>
+        <w:numPr>
+          <w:ilvl w:val="1"/>
+          <w:numId w:val="7"/>
+        </w:numPr>
+        <w:rPr>
+          <w:lang w:val="pt-BR"/>
+        </w:rPr>
+      </w:pPr>
+      <w:r>
+        <w:rPr>
+          <w:lang w:val="pt-BR"/>
+        </w:rPr>
+        <w:t>Despesas de Marketing</w:t>
+      </w:r>
+    </w:p>
+    <w:p>
+      <w:pPr>
+        <w:pStyle w:val="ListParagraph"/>
+        <w:numPr>
+          <w:ilvl w:val="1"/>
+          <w:numId w:val="7"/>
+        </w:numPr>
+        <w:rPr>
+          <w:lang w:val="pt-BR"/>
+        </w:rPr>
+      </w:pPr>
+      <w:r>
+        <w:rPr>
+          <w:lang w:val="pt-BR"/>
+        </w:rPr>
+        <w:t>Despesas com Serviços</w:t>
+      </w:r>
+    </w:p>
+    <w:p>
+      <w:pPr>
+        <w:pStyle w:val="ListParagraph"/>
+        <w:numPr>
+          <w:ilvl w:val="1"/>
+          <w:numId w:val="7"/>
+        </w:numPr>
+        <w:rPr>
+          <w:lang w:val="pt-BR"/>
+        </w:rPr>
+      </w:pPr>
+      <w:r>
+        <w:rPr>
+          <w:lang w:val="pt-BR"/>
+        </w:rPr>
+        <w:t>Despesas Bancárias / Tarifas</w:t>
+      </w:r>
+    </w:p>
+    <w:p>
+      <w:pPr>
+        <w:pStyle w:val="ListParagraph"/>
+        <w:numPr>
+          <w:ilvl w:val="1"/>
+          <w:numId w:val="7"/>
+        </w:numPr>
+        <w:rPr>
+          <w:lang w:val="pt-BR"/>
+        </w:rPr>
+      </w:pPr>
+      <w:r>
+        <w:rPr>
+          <w:lang w:val="pt-BR"/>
+        </w:rPr>
+        <w:t>Outras Despesas</w:t>
+      </w:r>
+    </w:p>
+    <w:p>
+      <w:pPr>
+        <w:rPr>
+          <w:lang w:val="pt-BR"/>
+        </w:rPr>
+      </w:pPr>
+    </w:p>
+    <w:p>
+      <w:pPr>
+        <w:pStyle w:val="ListParagraph"/>
+        <w:numPr>
+          <w:ilvl w:val="0"/>
+          <w:numId w:val="7"/>
+        </w:numPr>
+        <w:rPr>
+          <w:lang w:val="pt-BR"/>
+        </w:rPr>
+      </w:pPr>
+      <w:r>
+        <w:rPr>
+          <w:lang w:val="pt-BR"/>
+        </w:rPr>
+        <w:lastRenderedPageBreak/>
+        <w:t>DESPESAS COM PESSOAL</w:t>
+      </w:r>
+    </w:p>
+    <w:p>
+      <w:pPr>
+        <w:pStyle w:val="ListParagraph"/>
+        <w:numPr>
+          <w:ilvl w:val="1"/>
+          <w:numId w:val="7"/>
+        </w:numPr>
+        <w:rPr>
+          <w:lang w:val="pt-BR"/>
+        </w:rPr>
+      </w:pPr>
+      <w:r>
+        <w:rPr>
+          <w:lang w:val="pt-BR"/>
+        </w:rPr>
+        <w:t>Pró-Labore dos Sócios</w:t>
+      </w:r>
+    </w:p>
+    <w:p>
+      <w:pPr>
+        <w:pStyle w:val="ListParagraph"/>
+        <w:numPr>
+          <w:ilvl w:val="1"/>
+          <w:numId w:val="7"/>
+        </w:numPr>
+        <w:rPr>
+          <w:lang w:val="pt-BR"/>
+        </w:rPr>
+      </w:pPr>
+      <w:r>
+        <w:rPr>
+          <w:lang w:val="pt-BR"/>
+        </w:rPr>
+        <w:t>Colaborado</w:t>
+      </w:r>
+      <w:r>
+        <w:rPr>
+          <w:lang w:val="pt-BR"/>
+        </w:rPr>
+        <w:t>r</w:t>
+      </w:r>
+      <w:r>
+        <w:rPr>
+          <w:lang w:val="pt-BR"/>
+        </w:rPr>
+        <w:t>es-Empregados: Salários, Ajuda de Custo / Comissão de Vendedor</w:t>
+      </w:r>
+    </w:p>
+    <w:p>
+      <w:pPr>
+        <w:pStyle w:val="ListParagraph"/>
+        <w:numPr>
+          <w:ilvl w:val="1"/>
+          <w:numId w:val="7"/>
+        </w:numPr>
+        <w:rPr>
+          <w:lang w:val="pt-BR"/>
+        </w:rPr>
+      </w:pPr>
+      <w:r>
+        <w:rPr>
+          <w:lang w:val="pt-BR"/>
+        </w:rPr>
+        <w:t>Outras Despesas com Pessoal</w:t>
+      </w:r>
+    </w:p>
+    <w:p>
+      <w:pPr>
+        <w:rPr>
+          <w:lang w:val="pt-BR"/>
+        </w:rPr>
+      </w:pPr>
+    </w:p>
+    <w:p>
+      <w:pPr>
+        <w:pStyle w:val="ListParagraph"/>
+        <w:numPr>
+          <w:ilvl w:val="0"/>
+          <w:numId w:val="7"/>
+        </w:numPr>
+        <w:rPr>
+          <w:lang w:val="pt-BR"/>
+        </w:rPr>
+      </w:pPr>
+      <w:r>
+        <w:rPr>
+          <w:lang w:val="pt-BR"/>
+        </w:rPr>
+        <w:t xml:space="preserve">DESPESAS </w:t>
+      </w:r>
+      <w:r>
+        <w:rPr>
+          <w:lang w:val="pt-BR"/>
+        </w:rPr>
+        <w:t>NAO OPERACIONAIS</w:t>
+      </w:r>
+    </w:p>
+    <w:p>
+      <w:pPr>
+        <w:pStyle w:val="ListParagraph"/>
+        <w:numPr>
+          <w:ilvl w:val="1"/>
+          <w:numId w:val="7"/>
+        </w:numPr>
+        <w:rPr>
+          <w:lang w:val="pt-BR"/>
+        </w:rPr>
+      </w:pPr>
+      <w:r>
+        <w:rPr>
+          <w:lang w:val="pt-BR"/>
+        </w:rPr>
+        <w:t xml:space="preserve">Despesas Financeiras - </w:t>
+      </w:r>
+      <w:r>
+        <w:rPr>
+          <w:lang w:val="pt-BR"/>
+        </w:rPr>
+        <w:t>Juros / Multas</w:t>
+      </w:r>
+    </w:p>
+    <w:p>
+      <w:pPr>
+        <w:pStyle w:val="ListParagraph"/>
+        <w:numPr>
+          <w:ilvl w:val="1"/>
+          <w:numId w:val="7"/>
+        </w:numPr>
+        <w:rPr>
+          <w:lang w:val="pt-BR"/>
+        </w:rPr>
+      </w:pPr>
+      <w:r>
+        <w:rPr>
+          <w:lang w:val="pt-BR"/>
+        </w:rPr>
+        <w:t>Descontos Concedidos</w:t>
+      </w:r>
+    </w:p>
+    <w:p>
+      <w:pPr>
+        <w:pStyle w:val="ListParagraph"/>
+        <w:numPr>
+          <w:ilvl w:val="1"/>
+          <w:numId w:val="7"/>
+        </w:numPr>
+        <w:rPr>
+          <w:lang w:val="pt-BR"/>
+        </w:rPr>
+      </w:pPr>
+      <w:r>
+        <w:rPr>
+          <w:lang w:val="pt-BR"/>
+        </w:rPr>
+        <w:t xml:space="preserve">Receitas Financeiras – juros recebidos </w:t>
+      </w:r>
+    </w:p>
+    <w:p>
+      <w:pPr>
+        <w:pStyle w:val="ListParagraph"/>
+        <w:ind w:left="360"/>
+        <w:rPr>
+          <w:lang w:val="pt-BR"/>
+        </w:rPr>
+      </w:pPr>
+    </w:p>
+    <w:p>
+      <w:pPr>
+        <w:pStyle w:val="ListParagraph"/>
+        <w:numPr>
+          <w:ilvl w:val="0"/>
+          <w:numId w:val="7"/>
+        </w:numPr>
+        <w:rPr>
+          <w:lang w:val="pt-BR"/>
+        </w:rPr>
+      </w:pPr>
+      <w:r>
+        <w:rPr>
+          <w:lang w:val="pt-BR"/>
+        </w:rPr>
+        <w:t>INVESTIMENTOS</w:t>
+      </w:r>
+    </w:p>
+    <w:p>
+      <w:pPr>
+        <w:pStyle w:val="ListParagraph"/>
+        <w:numPr>
+          <w:ilvl w:val="1"/>
+          <w:numId w:val="7"/>
+        </w:numPr>
+        <w:rPr>
+          <w:lang w:val="pt-BR"/>
+        </w:rPr>
+      </w:pPr>
+      <w:r>
+        <w:rPr>
+          <w:lang w:val="pt-BR"/>
+        </w:rPr>
+        <w:t>Investimentos / Imobilizado (pintura, móveis, computadores, reformas, equipamentos)</w:t>
+      </w:r>
+    </w:p>
+    <w:p>
+      <w:pPr>
+        <w:rPr>
+          <w:lang w:val="pt-BR"/>
+        </w:rPr>
+      </w:pPr>
+    </w:p>
+    <w:p>
+      <w:pPr>
+        <w:rPr>
+          <w:lang w:val="pt-BR"/>
+        </w:rPr>
+      </w:pPr>
+      <w:r>
+        <w:rPr>
+          <w:lang w:val="pt-BR"/>
+        </w:rPr>
+        <w:t>Requisitos:</w:t>
+      </w:r>
+    </w:p>
+    <w:p>
+      <w:pPr>
+        <w:rPr>
+          <w:lang w:val="pt-BR"/>
+        </w:rPr>
+      </w:pPr>
+      <w:r>
+        <w:rPr>
+          <w:lang w:val="pt-BR"/>
+        </w:rPr>
+        <w:t>• Criar a tabela CategoriasFinanceiras no DatabaseInitializer.</w:t>
+      </w:r>
+    </w:p>
+    <w:p>
+      <w:pPr>
+        <w:rPr>
+          <w:lang w:val="pt-BR"/>
+        </w:rPr>
+      </w:pPr>
+      <w:r>
+        <w:rPr>
+          <w:lang w:val="pt-BR"/>
+        </w:rPr>
+        <w:t>• Popular a tabela com todas as categorias acima.</w:t>
+      </w:r>
+    </w:p>
+    <w:p>
+      <w:pPr>
+        <w:rPr>
+          <w:lang w:val="pt-BR"/>
+        </w:rPr>
+      </w:pPr>
+      <w:r>
+        <w:rPr>
+          <w:lang w:val="pt-BR"/>
+        </w:rPr>
+        <w:t>• Toda movimentação financeira deve exigir obrigatoriamente:</w:t>
+      </w:r>
+    </w:p>
+    <w:p>
+      <w:pPr>
+        <w:rPr>
+          <w:lang w:val="pt-BR"/>
+        </w:rPr>
+      </w:pPr>
+      <w:r>
+        <w:rPr>
+          <w:lang w:val="pt-BR"/>
+        </w:rPr>
+        <w:t xml:space="preserve">  - Forma de Pagamento</w:t>
+      </w:r>
+    </w:p>
+    <w:p>
+      <w:pPr>
+        <w:rPr>
+          <w:lang w:val="pt-BR"/>
+        </w:rPr>
+      </w:pPr>
+      <w:r>
+        <w:rPr>
+          <w:lang w:val="pt-BR"/>
+        </w:rPr>
+        <w:t xml:space="preserve">  - Centro Financeiro</w:t>
+      </w:r>
+    </w:p>
+    <w:p>
+      <w:pPr>
+        <w:rPr>
+          <w:lang w:val="pt-BR"/>
+        </w:rPr>
+      </w:pPr>
+      <w:r>
+        <w:rPr>
+          <w:lang w:val="pt-BR"/>
+        </w:rPr>
+        <w:t xml:space="preserve">  - Categoria Financeira</w:t>
+      </w:r>
+    </w:p>
+    <w:p>
+      <w:pPr>
+        <w:rPr>
+          <w:lang w:val="pt-BR"/>
+        </w:rPr>
+      </w:pPr>
+      <w:r>
+        <w:rPr>
+          <w:lang w:val="pt-BR"/>
+        </w:rPr>
+        <w:t>• Ajustar o módulo financeiro para permitir múltiplas categorias por transação, quando necessário.</w:t>
+      </w:r>
+    </w:p>
+    <w:p>
+      <w:pPr>
+        <w:rPr>
+          <w:lang w:val="pt-BR"/>
+        </w:rPr>
+      </w:pPr>
+      <w:r>
+        <w:rPr>
+          <w:lang w:val="pt-BR"/>
+        </w:rPr>
+        <w:t>• Ajustar o módulo financeiro para permitir múltiplas formas de pagamento por transação (como já instruído).</w:t>
+      </w:r>
+    </w:p>
+    <w:p>
+      <w:pPr>
+        <w:rPr>
+          <w:lang w:val="pt-BR"/>
+        </w:rPr>
+      </w:pPr>
+      <w:r>
+        <w:rPr>
+          <w:lang w:val="pt-BR"/>
+        </w:rPr>
+        <w:t>• Substituir qualquer lógica antiga de categorias ou tipos de movimentação.</w:t>
+      </w:r>
+    </w:p>
+    <w:p>
+      <w:pPr>
+        <w:rPr>
+          <w:lang w:val="pt-BR"/>
+        </w:rPr>
+      </w:pPr>
+      <w:r>
+        <w:rPr>
+          <w:lang w:val="pt-BR"/>
+        </w:rPr>
+        <w:t>• Garantir que o relatório financeiro mensal possa agrupar e somar valores por categoria.</w:t>
+      </w:r>
+    </w:p>
+    <w:p>
+      <w:pPr>
+        <w:rPr>
+          <w:lang w:val="pt-BR"/>
+        </w:rPr>
+      </w:pPr>
+      <w:r>
+        <w:rPr>
+          <w:lang w:val="pt-BR"/>
+        </w:rPr>
+        <w:t>• Validar a compilação ao final.</w:t>
+      </w:r>
+    </w:p>
+    <w:p>
+      <w:pPr>
+        <w:rPr>
+          <w:lang w:val="pt-BR"/>
+        </w:rPr>
+      </w:pPr>
+      <w:r>
+        <w:rPr>
+          <w:lang w:val="pt-BR"/>
+        </w:rPr>
+        <w:t>• Listar todos os arquivos alterados e o que foi modificado em cada um.</w:t>
+      </w:r>
+    </w:p>
+    <w:p>
+      <w:pPr>
+        <w:rPr>
+          <w:lang w:val="pt-BR"/>
+        </w:rPr>
+      </w:pPr>
+    </w:p>
+    <w:p>
+      <w:pPr>
+        <w:rPr>
+          <w:lang w:val="pt-BR"/>
+        </w:rPr>
+      </w:pPr>
+      <w:r>
+        <w:rPr>
+          <w:lang w:val="pt-BR"/>
+        </w:rPr>
+        <w:lastRenderedPageBreak/>
+        <w:t>Quando terminar, me avise que está pronto para eu testar.</w:t>
+      </w:r>
+    </w:p>
+    <w:p>
+      <w:pPr>
+        <w:rPr>
+          <w:lang w:val="pt-BR"/>
+        </w:rPr>
+      </w:pPr>
+    </w:p>
+    <w:p>
+      <w:pPr>
+        <w:rPr>
+          <w:lang w:val="pt-BR"/>
+        </w:rPr>
+      </w:pPr>
+    </w:p>
+    <w:p>
+      <w:pPr>
+        <w:rPr>
+          <w:lang w:val="pt-BR"/>
+        </w:rPr>
+      </w:pPr>
+    </w:p>
+    <w:p>
+      <w:pPr>
+        <w:rPr>
+          <w:lang w:val="pt-BR"/>
+        </w:rPr>
+      </w:pPr>
+    </w:p>
+    <w:p>
+      <w:pPr>
+        <w:rPr>
+          <w:lang w:val="pt-BR"/>
+        </w:rPr>
+      </w:pPr>
+    </w:p>
+    <w:p>
+      <w:pPr>
+        <w:rPr>
+          <w:lang w:val="pt-BR"/>
+        </w:rPr>
+      </w:pPr>
+    </w:p>
+    <w:p>
+      <w:pPr>
+        <w:rPr>
+          <w:lang w:val="pt-BR"/>
+        </w:rPr>
+      </w:pPr>
+      <w:r>
+        <w:rPr>
+          <w:lang w:val="pt-BR"/>
+        </w:rPr>
+        <w:t>Preciso que você ajuste a tela de Movimentações Financeiras para que o campo de Categoria Financeira funcione da mesma forma que o campo de Forma de Pagamento.</w:t>
+      </w:r>
+    </w:p>
+    <w:p>
+      <w:pPr>
+        <w:rPr>
+          <w:lang w:val="pt-BR"/>
+        </w:rPr>
+      </w:pPr>
+    </w:p>
+    <w:p>
+      <w:pPr>
+        <w:rPr>
+          <w:lang w:val="pt-BR"/>
+        </w:rPr>
+      </w:pPr>
+      <w:r>
+        <w:rPr>
+          <w:lang w:val="pt-BR"/>
+        </w:rPr>
+        <w:t>Atualmente o ComboBox de Categoria Financeira aparece, mas não exibe nenhuma opção. Quero que você:</w:t>
+      </w:r>
+    </w:p>
+    <w:p>
+      <w:pPr>
+        <w:rPr>
+          <w:lang w:val="pt-BR"/>
+        </w:rPr>
+      </w:pPr>
+    </w:p>
+    <w:p>
+      <w:pPr>
+        <w:rPr>
+          <w:lang w:val="pt-BR"/>
+        </w:rPr>
+      </w:pPr>
+      <w:r>
+        <w:rPr>
+          <w:lang w:val="pt-BR"/>
+        </w:rPr>
+        <w:t>1. Carregue automaticamente todas as categorias da tabela CategoriasFinanceiras.</w:t>
+      </w:r>
+    </w:p>
+    <w:p>
+      <w:pPr>
+        <w:rPr>
+          <w:lang w:val="pt-BR"/>
+        </w:rPr>
+      </w:pPr>
+      <w:r>
+        <w:rPr>
+          <w:lang w:val="pt-BR"/>
+        </w:rPr>
+        <w:t>2. Preencha o ComboBox com a lista completa de categorias.</w:t>
+      </w:r>
+    </w:p>
+    <w:p>
+      <w:pPr>
+        <w:rPr>
+          <w:lang w:val="pt-BR"/>
+        </w:rPr>
+      </w:pPr>
+      <w:r>
+        <w:rPr>
+          <w:lang w:val="pt-BR"/>
+        </w:rPr>
+        <w:t>3. Use o mesmo padrão de carregamento já utilizado para o ComboBox de Formas de Pagamento.</w:t>
+      </w:r>
+    </w:p>
+    <w:p>
+      <w:pPr>
+        <w:rPr>
+          <w:lang w:val="pt-BR"/>
+        </w:rPr>
+      </w:pPr>
+      <w:r>
+        <w:rPr>
+          <w:lang w:val="pt-BR"/>
+        </w:rPr>
+        <w:t>4. Garanta que a categoria selecionada seja salva corretamente na movimentação financeira.</w:t>
+      </w:r>
+    </w:p>
+    <w:p>
+      <w:pPr>
+        <w:rPr>
+          <w:lang w:val="pt-BR"/>
+        </w:rPr>
+      </w:pPr>
+      <w:r>
+        <w:rPr>
+          <w:lang w:val="pt-BR"/>
+        </w:rPr>
+        <w:t>5. Ajuste o binding, repositório ou serviço, caso necessário.</w:t>
+      </w:r>
+    </w:p>
+    <w:p>
+      <w:pPr>
+        <w:rPr>
+          <w:lang w:val="pt-BR"/>
+        </w:rPr>
+      </w:pPr>
+      <w:r>
+        <w:rPr>
+          <w:lang w:val="pt-BR"/>
+        </w:rPr>
+        <w:t>6. Valide a compilação ao final e liste os arquivos alterados.</w:t>
+      </w:r>
+    </w:p>
+    <w:p>
+      <w:pPr>
+        <w:rPr>
+          <w:lang w:val="pt-BR"/>
+        </w:rPr>
+      </w:pPr>
+    </w:p>
+    <w:p>
+      <w:pPr>
+        <w:rPr>
+          <w:lang w:val="pt-BR"/>
+        </w:rPr>
+      </w:pPr>
+      <w:r>
+        <w:rPr>
+          <w:lang w:val="pt-BR"/>
+        </w:rPr>
+        <w:t>O comportamento final deve ser:</w:t>
+      </w:r>
+    </w:p>
+    <w:p>
+      <w:pPr>
+        <w:rPr>
+          <w:lang w:val="pt-BR"/>
+        </w:rPr>
+      </w:pPr>
+      <w:r>
+        <w:rPr>
+          <w:lang w:val="pt-BR"/>
+        </w:rPr>
+        <w:t>• Ao abrir a tela, o ComboBox de Categoria Financeira deve exibir todas as categorias criadas no DatabaseInitializer.</w:t>
+      </w:r>
+    </w:p>
+    <w:p>
+      <w:pPr>
+        <w:rPr>
+          <w:lang w:val="pt-BR"/>
+        </w:rPr>
+      </w:pPr>
+      <w:r>
+        <w:rPr>
+          <w:lang w:val="pt-BR"/>
+        </w:rPr>
+        <w:t>• O usuário deve conseguir selecionar uma categoria normalmente.</w:t>
+      </w:r>
+    </w:p>
+    <w:p>
+      <w:pPr>
         <w:rPr>
           <w:b/>
           <w:bCs/>
-          <w:lang w:val="pt-BR"/>
-        </w:rPr>
-        <w:t>de ponta a ponta</w:t>
-      </w:r>
-      <w:r>
-        <w:rPr>
-          <w:lang w:val="pt-BR"/>
-        </w:rPr>
-        <w:t xml:space="preserve">, existem </w:t>
-      </w:r>
-      <w:r>
+          <w:color w:val="0070C0"/>
+          <w:lang w:val="pt-BR"/>
+        </w:rPr>
+      </w:pPr>
+    </w:p>
+    <w:p>
+      <w:pPr>
         <w:rPr>
           <w:b/>
           <w:bCs/>
-          <w:lang w:val="pt-BR"/>
-        </w:rPr>
-        <w:t>6 arquivos críticos</w:t>
-      </w:r>
-      <w:r>
-        <w:rPr>
-          <w:lang w:val="pt-BR"/>
-        </w:rPr>
-        <w:t>:</w:t>
-      </w:r>
-    </w:p>
-    <w:p>
-      <w:pPr>
-        <w:rPr>
+          <w:color w:val="0070C0"/>
           <w:lang w:val="pt-BR"/>
         </w:rPr>
       </w:pPr>
@@ -797,6 +1673,65 @@
         <w:rPr>
           <w:b/>
           <w:bCs/>
+          <w:color w:val="0070C0"/>
+          <w:highlight w:val="yellow"/>
+          <w:lang w:val="pt-BR"/>
+        </w:rPr>
+        <w:lastRenderedPageBreak/>
+        <w:t>dddddddddddddddddddddddd</w:t>
+      </w:r>
+    </w:p>
+    <w:p>
+      <w:pPr>
+        <w:rPr>
+          <w:lang w:val="pt-BR"/>
+        </w:rPr>
+      </w:pPr>
+      <w:r>
+        <w:rPr>
+          <w:lang w:val="pt-BR"/>
+        </w:rPr>
+        <w:t xml:space="preserve">Para que o fluxo de entrada de material funcione </w:t>
+      </w:r>
+      <w:r>
+        <w:rPr>
+          <w:b/>
+          <w:bCs/>
+          <w:lang w:val="pt-BR"/>
+        </w:rPr>
+        <w:t>de ponta a ponta</w:t>
+      </w:r>
+      <w:r>
+        <w:rPr>
+          <w:lang w:val="pt-BR"/>
+        </w:rPr>
+        <w:t xml:space="preserve">, existem </w:t>
+      </w:r>
+      <w:r>
+        <w:rPr>
+          <w:b/>
+          <w:bCs/>
+          <w:lang w:val="pt-BR"/>
+        </w:rPr>
+        <w:t>6 arquivos críticos</w:t>
+      </w:r>
+      <w:r>
+        <w:rPr>
+          <w:lang w:val="pt-BR"/>
+        </w:rPr>
+        <w:t>:</w:t>
+      </w:r>
+    </w:p>
+    <w:p>
+      <w:pPr>
+        <w:rPr>
+          <w:lang w:val="pt-BR"/>
+        </w:rPr>
+      </w:pPr>
+      <w:r>
+        <w:rPr>
+          <w:b/>
+          <w:bCs/>
           <w:lang w:val="pt-BR"/>
         </w:rPr>
         <w:t>1) DatabaseInitializer.cs</w:t>
@@ -931,7 +1866,6 @@
         <w:rPr>
           <w:lang w:val="pt-BR"/>
         </w:rPr>
-        <w:lastRenderedPageBreak/>
         <w:t>CRUD dos itens do lote.</w:t>
       </w:r>
       <w:r>
@@ -1099,6 +2033,7 @@
           <w:bCs/>
           <w:lang w:val="pt-BR"/>
         </w:rPr>
+        <w:lastRenderedPageBreak/>
         <w:t>4) ItemLoteRepository.cs</w:t>
       </w:r>
     </w:p>
@@ -1426,6 +2361,7 @@
         <w:rPr>
           <w:lang w:val="pt-BR"/>
         </w:rPr>
+        <w:lastRenderedPageBreak/>
         <w:t>Acho que nao soube explicar claramente o que queria.</w:t>
       </w:r>
     </w:p>
@@ -1548,7 +2484,6 @@
         <w:rPr>
           <w:lang w:val="pt-BR"/>
         </w:rPr>
-        <w:lastRenderedPageBreak/>
         <w:tab/>
         <w:t>Vendas –  este processo deve ser igual ao Curadoria.  Chamar um processo que vai cadastara o vendedor.  Igualmente nesta etapa tera um botao para cadastra Vendas que vai ser chamar Gerar Venda.</w:t>
       </w:r>
@@ -1598,6 +2533,7 @@
           <w:noProof/>
           <w:lang w:val="pt-BR"/>
         </w:rPr>
+        <w:lastRenderedPageBreak/>
         <w:drawing>
           <wp:inline distT="0" distB="0" distL="0" distR="0" wp14:anchorId="5641B43F" wp14:editId="1D021828">
             <wp:extent cx="5943600" cy="3812540"/>
@@ -1653,7 +2589,6 @@
           <w:noProof/>
           <w:lang w:val="pt-BR"/>
         </w:rPr>
-        <w:lastRenderedPageBreak/>
         <w:drawing>
           <wp:inline distT="0" distB="0" distL="0" distR="0" wp14:anchorId="2A449062" wp14:editId="311B502D">
             <wp:extent cx="5943600" cy="3773805"/>
@@ -1894,6 +2829,270 @@
     </w:lvl>
   </w:abstractNum>
   <w:abstractNum w:abstractNumId="1" w15:restartNumberingAfterBreak="0">
+    <w:nsid w:val="35ED73B1"/>
+    <w:multiLevelType w:val="hybridMultilevel"/>
+    <w:tmpl w:val="45CADDD4"/>
+    <w:lvl w:ilvl="0" w:tplc="0409000F">
+      <w:start w:val="1"/>
+      <w:numFmt w:val="decimal"/>
+      <w:lvlText w:val="%1."/>
+      <w:lvlJc w:val="left"/>
+      <w:pPr>
+        <w:ind w:left="720" w:hanging="360"/>
+      </w:pPr>
+      <w:rPr>
+        <w:rFonts w:hint="default"/>
+      </w:rPr>
+    </w:lvl>
+    <w:lvl w:ilvl="1" w:tplc="A96E7886">
+      <w:start w:val="1"/>
+      <w:numFmt w:val="bullet"/>
+      <w:lvlText w:val="•"/>
+      <w:lvlJc w:val="left"/>
+      <w:pPr>
+        <w:ind w:left="1440" w:hanging="360"/>
+      </w:pPr>
+      <w:rPr>
+        <w:rFonts w:ascii="Aptos" w:eastAsiaTheme="minorHAnsi" w:hAnsi="Aptos" w:cstheme="minorBidi" w:hint="default"/>
+      </w:rPr>
+    </w:lvl>
+    <w:lvl w:ilvl="2" w:tplc="0409001B" w:tentative="1">
+      <w:start w:val="1"/>
+      <w:numFmt w:val="lowerRoman"/>
+      <w:lvlText w:val="%3."/>
+      <w:lvlJc w:val="right"/>
+      <w:pPr>
+        <w:ind w:left="2160" w:hanging="180"/>
+      </w:pPr>
+    </w:lvl>
+    <w:lvl w:ilvl="3" w:tplc="0409000F" w:tentative="1">
+      <w:start w:val="1"/>
+      <w:numFmt w:val="decimal"/>
+      <w:lvlText w:val="%4."/>
+      <w:lvlJc w:val="left"/>
+      <w:pPr>
+        <w:ind w:left="2880" w:hanging="360"/>
+      </w:pPr>
+    </w:lvl>
+    <w:lvl w:ilvl="4" w:tplc="04090019" w:tentative="1">
+      <w:start w:val="1"/>
+      <w:numFmt w:val="lowerLetter"/>
+      <w:lvlText w:val="%5."/>
+      <w:lvlJc w:val="left"/>
+      <w:pPr>
+        <w:ind w:left="3600" w:hanging="360"/>
+      </w:pPr>
+    </w:lvl>
+    <w:lvl w:ilvl="5" w:tplc="0409001B" w:tentative="1">
+      <w:start w:val="1"/>
+      <w:numFmt w:val="lowerRoman"/>
+      <w:lvlText w:val="%6."/>
+      <w:lvlJc w:val="right"/>
+      <w:pPr>
+        <w:ind w:left="4320" w:hanging="180"/>
+      </w:pPr>
+    </w:lvl>
+    <w:lvl w:ilvl="6" w:tplc="0409000F" w:tentative="1">
+      <w:start w:val="1"/>
+      <w:numFmt w:val="decimal"/>
+      <w:lvlText w:val="%7."/>
+      <w:lvlJc w:val="left"/>
+      <w:pPr>
+        <w:ind w:left="5040" w:hanging="360"/>
+      </w:pPr>
+    </w:lvl>
+    <w:lvl w:ilvl="7" w:tplc="04090019" w:tentative="1">
+      <w:start w:val="1"/>
+      <w:numFmt w:val="lowerLetter"/>
+      <w:lvlText w:val="%8."/>
+      <w:lvlJc w:val="left"/>
+      <w:pPr>
+        <w:ind w:left="5760" w:hanging="360"/>
+      </w:pPr>
+    </w:lvl>
+    <w:lvl w:ilvl="8" w:tplc="0409001B" w:tentative="1">
+      <w:start w:val="1"/>
+      <w:numFmt w:val="lowerRoman"/>
+      <w:lvlText w:val="%9."/>
+      <w:lvlJc w:val="right"/>
+      <w:pPr>
+        <w:ind w:left="6480" w:hanging="180"/>
+      </w:pPr>
+    </w:lvl>
+  </w:abstractNum>
+  <w:abstractNum w:abstractNumId="2" w15:restartNumberingAfterBreak="0">
+    <w:nsid w:val="423241B5"/>
+    <w:multiLevelType w:val="multilevel"/>
+    <w:tmpl w:val="0409001F"/>
+    <w:lvl w:ilvl="0">
+      <w:start w:val="1"/>
+      <w:numFmt w:val="decimal"/>
+      <w:lvlText w:val="%1."/>
+      <w:lvlJc w:val="left"/>
+      <w:pPr>
+        <w:ind w:left="360" w:hanging="360"/>
+      </w:pPr>
+    </w:lvl>
+    <w:lvl w:ilvl="1">
+      <w:start w:val="1"/>
+      <w:numFmt w:val="decimal"/>
+      <w:lvlText w:val="%1.%2."/>
+      <w:lvlJc w:val="left"/>
+      <w:pPr>
+        <w:ind w:left="792" w:hanging="432"/>
+      </w:pPr>
+    </w:lvl>
+    <w:lvl w:ilvl="2">
+      <w:start w:val="1"/>
+      <w:numFmt w:val="decimal"/>
+      <w:lvlText w:val="%1.%2.%3."/>
+      <w:lvlJc w:val="left"/>
+      <w:pPr>
+        <w:ind w:left="1224" w:hanging="504"/>
+      </w:pPr>
+    </w:lvl>
+    <w:lvl w:ilvl="3">
+      <w:start w:val="1"/>
+      <w:numFmt w:val="decimal"/>
+      <w:lvlText w:val="%1.%2.%3.%4."/>
+      <w:lvlJc w:val="left"/>
+      <w:pPr>
+        <w:ind w:left="1728" w:hanging="648"/>
+      </w:pPr>
+    </w:lvl>
+    <w:lvl w:ilvl="4">
+      <w:start w:val="1"/>
+      <w:numFmt w:val="decimal"/>
+      <w:lvlText w:val="%1.%2.%3.%4.%5."/>
+      <w:lvlJc w:val="left"/>
+      <w:pPr>
+        <w:ind w:left="2232" w:hanging="792"/>
+      </w:pPr>
+    </w:lvl>
+    <w:lvl w:ilvl="5">
+      <w:start w:val="1"/>
+      <w:numFmt w:val="decimal"/>
+      <w:lvlText w:val="%1.%2.%3.%4.%5.%6."/>
+      <w:lvlJc w:val="left"/>
+      <w:pPr>
+        <w:ind w:left="2736" w:hanging="936"/>
+      </w:pPr>
+    </w:lvl>
+    <w:lvl w:ilvl="6">
+      <w:start w:val="1"/>
+      <w:numFmt w:val="decimal"/>
+      <w:lvlText w:val="%1.%2.%3.%4.%5.%6.%7."/>
+      <w:lvlJc w:val="left"/>
+      <w:pPr>
+        <w:ind w:left="3240" w:hanging="1080"/>
+      </w:pPr>
+    </w:lvl>
+    <w:lvl w:ilvl="7">
+      <w:start w:val="1"/>
+      <w:numFmt w:val="decimal"/>
+      <w:lvlText w:val="%1.%2.%3.%4.%5.%6.%7.%8."/>
+      <w:lvlJc w:val="left"/>
+      <w:pPr>
+        <w:ind w:left="3744" w:hanging="1224"/>
+      </w:pPr>
+    </w:lvl>
+    <w:lvl w:ilvl="8">
+      <w:start w:val="1"/>
+      <w:numFmt w:val="decimal"/>
+      <w:lvlText w:val="%1.%2.%3.%4.%5.%6.%7.%8.%9."/>
+      <w:lvlJc w:val="left"/>
+      <w:pPr>
+        <w:ind w:left="4320" w:hanging="1440"/>
+      </w:pPr>
+    </w:lvl>
+  </w:abstractNum>
+  <w:abstractNum w:abstractNumId="3" w15:restartNumberingAfterBreak="0">
+    <w:nsid w:val="4C464BAF"/>
+    <w:multiLevelType w:val="multilevel"/>
+    <w:tmpl w:val="0409001D"/>
+    <w:lvl w:ilvl="0">
+      <w:start w:val="1"/>
+      <w:numFmt w:val="decimal"/>
+      <w:lvlText w:val="%1)"/>
+      <w:lvlJc w:val="left"/>
+      <w:pPr>
+        <w:ind w:left="360" w:hanging="360"/>
+      </w:pPr>
+    </w:lvl>
+    <w:lvl w:ilvl="1">
+      <w:start w:val="1"/>
+      <w:numFmt w:val="lowerLetter"/>
+      <w:lvlText w:val="%2)"/>
+      <w:lvlJc w:val="left"/>
+      <w:pPr>
+        <w:ind w:left="720" w:hanging="360"/>
+      </w:pPr>
+    </w:lvl>
+    <w:lvl w:ilvl="2">
+      <w:start w:val="1"/>
+      <w:numFmt w:val="lowerRoman"/>
+      <w:lvlText w:val="%3)"/>
+      <w:lvlJc w:val="left"/>
+      <w:pPr>
+        <w:ind w:left="1080" w:hanging="360"/>
+      </w:pPr>
+    </w:lvl>
+    <w:lvl w:ilvl="3">
+      <w:start w:val="1"/>
+      <w:numFmt w:val="decimal"/>
+      <w:lvlText w:val="(%4)"/>
+      <w:lvlJc w:val="left"/>
+      <w:pPr>
+        <w:ind w:left="1440" w:hanging="360"/>
+      </w:pPr>
+    </w:lvl>
+    <w:lvl w:ilvl="4">
+      <w:start w:val="1"/>
+      <w:numFmt w:val="lowerLetter"/>
+      <w:lvlText w:val="(%5)"/>
+      <w:lvlJc w:val="left"/>
+      <w:pPr>
+        <w:ind w:left="1800" w:hanging="360"/>
+      </w:pPr>
+    </w:lvl>
+    <w:lvl w:ilvl="5">
+      <w:start w:val="1"/>
+      <w:numFmt w:val="lowerRoman"/>
+      <w:lvlText w:val="(%6)"/>
+      <w:lvlJc w:val="left"/>
+      <w:pPr>
+        <w:ind w:left="2160" w:hanging="360"/>
+      </w:pPr>
+    </w:lvl>
+    <w:lvl w:ilvl="6">
+      <w:start w:val="1"/>
+      <w:numFmt w:val="decimal"/>
+      <w:lvlText w:val="%7."/>
+      <w:lvlJc w:val="left"/>
+      <w:pPr>
+        <w:ind w:left="2520" w:hanging="360"/>
+      </w:pPr>
+    </w:lvl>
+    <w:lvl w:ilvl="7">
+      <w:start w:val="1"/>
+      <w:numFmt w:val="lowerLetter"/>
+      <w:lvlText w:val="%8."/>
+      <w:lvlJc w:val="left"/>
+      <w:pPr>
+        <w:ind w:left="2880" w:hanging="360"/>
+      </w:pPr>
+    </w:lvl>
+    <w:lvl w:ilvl="8">
+      <w:start w:val="1"/>
+      <w:numFmt w:val="lowerRoman"/>
+      <w:lvlText w:val="%9."/>
+      <w:lvlJc w:val="left"/>
+      <w:pPr>
+        <w:ind w:left="3240" w:hanging="360"/>
+      </w:pPr>
+    </w:lvl>
+  </w:abstractNum>
+  <w:abstractNum w:abstractNumId="4" w15:restartNumberingAfterBreak="0">
     <w:nsid w:val="588B06AA"/>
     <w:multiLevelType w:val="hybridMultilevel"/>
     <w:tmpl w:val="3CC0ED36"/>
@@ -1982,7 +3181,120 @@
       </w:pPr>
     </w:lvl>
   </w:abstractNum>
-  <w:abstractNum w:abstractNumId="2" w15:restartNumberingAfterBreak="0">
+  <w:abstractNum w:abstractNumId="5" w15:restartNumberingAfterBreak="0">
+    <w:nsid w:val="5E9A7995"/>
+    <w:multiLevelType w:val="hybridMultilevel"/>
+    <w:tmpl w:val="1C3C804A"/>
+    <w:lvl w:ilvl="0" w:tplc="9348A276">
+      <w:start w:val="6"/>
+      <w:numFmt w:val="bullet"/>
+      <w:lvlText w:val=""/>
+      <w:lvlJc w:val="left"/>
+      <w:pPr>
+        <w:ind w:left="1080" w:hanging="360"/>
+      </w:pPr>
+      <w:rPr>
+        <w:rFonts w:ascii="Symbol" w:eastAsiaTheme="minorHAnsi" w:hAnsi="Symbol" w:cstheme="minorBidi" w:hint="default"/>
+      </w:rPr>
+    </w:lvl>
+    <w:lvl w:ilvl="1" w:tplc="04090003" w:tentative="1">
+      <w:start w:val="1"/>
+      <w:numFmt w:val="bullet"/>
+      <w:lvlText w:val="o"/>
+      <w:lvlJc w:val="left"/>
+      <w:pPr>
+        <w:ind w:left="1800" w:hanging="360"/>
+      </w:pPr>
+      <w:rPr>
+        <w:rFonts w:ascii="Courier New" w:hAnsi="Courier New" w:cs="Courier New" w:hint="default"/>
+      </w:rPr>
+    </w:lvl>
+    <w:lvl w:ilvl="2" w:tplc="04090005" w:tentative="1">
+      <w:start w:val="1"/>
+      <w:numFmt w:val="bullet"/>
+      <w:lvlText w:val=""/>
+      <w:lvlJc w:val="left"/>
+      <w:pPr>
+        <w:ind w:left="2520" w:hanging="360"/>
+      </w:pPr>
+      <w:rPr>
+        <w:rFonts w:ascii="Wingdings" w:hAnsi="Wingdings" w:hint="default"/>
+      </w:rPr>
+    </w:lvl>
+    <w:lvl w:ilvl="3" w:tplc="04090001" w:tentative="1">
+      <w:start w:val="1"/>
+      <w:numFmt w:val="bullet"/>
+      <w:lvlText w:val=""/>
+      <w:lvlJc w:val="left"/>
+      <w:pPr>
+        <w:ind w:left="3240" w:hanging="360"/>
+      </w:pPr>
+      <w:rPr>
+        <w:rFonts w:ascii="Symbol" w:hAnsi="Symbol" w:hint="default"/>
+      </w:rPr>
+    </w:lvl>
+    <w:lvl w:ilvl="4" w:tplc="04090003" w:tentative="1">
+      <w:start w:val="1"/>
+      <w:numFmt w:val="bullet"/>
+      <w:lvlText w:val="o"/>
+      <w:lvlJc w:val="left"/>
+      <w:pPr>
+        <w:ind w:left="3960" w:hanging="360"/>
+      </w:pPr>
+      <w:rPr>
+        <w:rFonts w:ascii="Courier New" w:hAnsi="Courier New" w:cs="Courier New" w:hint="default"/>
+      </w:rPr>
+    </w:lvl>
+    <w:lvl w:ilvl="5" w:tplc="04090005" w:tentative="1">
+      <w:start w:val="1"/>
+      <w:numFmt w:val="bullet"/>
+      <w:lvlText w:val=""/>
+      <w:lvlJc w:val="left"/>
+      <w:pPr>
+        <w:ind w:left="4680" w:hanging="360"/>
+      </w:pPr>
+      <w:rPr>
+        <w:rFonts w:ascii="Wingdings" w:hAnsi="Wingdings" w:hint="default"/>
+      </w:rPr>
+    </w:lvl>
+    <w:lvl w:ilvl="6" w:tplc="04090001" w:tentative="1">
+      <w:start w:val="1"/>
+      <w:numFmt w:val="bullet"/>
+      <w:lvlText w:val=""/>
+      <w:lvlJc w:val="left"/>
+      <w:pPr>
+        <w:ind w:left="5400" w:hanging="360"/>
+      </w:pPr>
+      <w:rPr>
+        <w:rFonts w:ascii="Symbol" w:hAnsi="Symbol" w:hint="default"/>
+      </w:rPr>
+    </w:lvl>
+    <w:lvl w:ilvl="7" w:tplc="04090003" w:tentative="1">
+      <w:start w:val="1"/>
+      <w:numFmt w:val="bullet"/>
+      <w:lvlText w:val="o"/>
+      <w:lvlJc w:val="left"/>
+      <w:pPr>
+        <w:ind w:left="6120" w:hanging="360"/>
+      </w:pPr>
+      <w:rPr>
+        <w:rFonts w:ascii="Courier New" w:hAnsi="Courier New" w:cs="Courier New" w:hint="default"/>
+      </w:rPr>
+    </w:lvl>
+    <w:lvl w:ilvl="8" w:tplc="04090005" w:tentative="1">
+      <w:start w:val="1"/>
+      <w:numFmt w:val="bullet"/>
+      <w:lvlText w:val=""/>
+      <w:lvlJc w:val="left"/>
+      <w:pPr>
+        <w:ind w:left="6840" w:hanging="360"/>
+      </w:pPr>
+      <w:rPr>
+        <w:rFonts w:ascii="Wingdings" w:hAnsi="Wingdings" w:hint="default"/>
+      </w:rPr>
+    </w:lvl>
+  </w:abstractNum>
+  <w:abstractNum w:abstractNumId="6" w15:restartNumberingAfterBreak="0">
     <w:nsid w:val="75784C63"/>
     <w:multiLevelType w:val="hybridMultilevel"/>
     <w:tmpl w:val="31249DEC"/>
@@ -2072,13 +3384,25 @@
     </w:lvl>
   </w:abstractNum>
   <w:num w:numId="1" w16cid:durableId="770930900">
-    <w:abstractNumId w:val="1"/>
+    <w:abstractNumId w:val="4"/>
   </w:num>
   <w:num w:numId="2" w16cid:durableId="772746319">
-    <w:abstractNumId w:val="2"/>
+    <w:abstractNumId w:val="6"/>
   </w:num>
   <w:num w:numId="3" w16cid:durableId="580717764">
     <w:abstractNumId w:val="0"/>
+  </w:num>
+  <w:num w:numId="4" w16cid:durableId="1253318115">
+    <w:abstractNumId w:val="5"/>
+  </w:num>
+  <w:num w:numId="5" w16cid:durableId="1330790952">
+    <w:abstractNumId w:val="3"/>
+  </w:num>
+  <w:num w:numId="6" w16cid:durableId="1379744222">
+    <w:abstractNumId w:val="1"/>
+  </w:num>
+  <w:num w:numId="7" w16cid:durableId="307367467">
+    <w:abstractNumId w:val="2"/>
   </w:num>
 </w:numbering>
 </file>

</xml_diff>